<commit_message>
Use the full logo mark in document headers, not a cropped icon
Replace the cropped gear-only icon with the complete
nes-symbol-only.png (gear + lock/monitor mark, NES wordmark, and
star rating) as requested, sized to fit the letterhead header
alongside the typed company name and tagline.
</commit_message>
<xml_diff>
--- a/templates/business-documents/COMPANY_PROFILE.docx
+++ b/templates/business-documents/COMPANY_PROFILE.docx
@@ -791,13 +791,13 @@
     <w:tr>
       <w:tc>
         <w:tcPr>
-          <w:tcW w:type="dxa" w:w="1440"/>
+          <w:tcW w:type="dxa" w:w="1872"/>
         </w:tcPr>
         <w:p>
           <w:r>
             <w:drawing>
               <wp:inline xmlns:a="http://schemas.openxmlformats.org/drawingml/2006/main" xmlns:pic="http://schemas.openxmlformats.org/drawingml/2006/picture">
-                <wp:extent cx="324066" cy="457200"/>
+                <wp:extent cx="892395" cy="502920"/>
                 <wp:docPr id="1" name="Picture 1"/>
                 <wp:cNvGraphicFramePr>
                   <a:graphicFrameLocks noChangeAspect="1"/>
@@ -818,7 +818,7 @@
                       <pic:spPr>
                         <a:xfrm>
                           <a:off x="0" y="0"/>
-                          <a:ext cx="324066" cy="457200"/>
+                          <a:ext cx="892395" cy="502920"/>
                         </a:xfrm>
                         <a:prstGeom prst="rect"/>
                       </pic:spPr>
@@ -832,7 +832,7 @@
       </w:tc>
       <w:tc>
         <w:tcPr>
-          <w:tcW w:type="dxa" w:w="8496"/>
+          <w:tcW w:type="dxa" w:w="8064"/>
         </w:tcPr>
         <w:p>
           <w:pPr>

</xml_diff>